<commit_message>
Replace narrated demo with silent motion-graphics + guided-tour walkthrough video
Animated HTML storyboard (problem, pipeline, streaming timeline, results) and
spotlight tours over real-time replays in the live UI; no narration or
captions. Disclosure and README updated accordingly.

Co-Authored-By: Claude Opus 5.5 <noreply@anthropic.com>
</commit_message>
<xml_diff>
--- a/submission/LangAI3.0_AI_Disclosure.docx
+++ b/submission/LangAI3.0_AI_Disclosure.docx
@@ -189,7 +189,7 @@
       </w:r>
       <w:r/>
       <w:r>
-        <w:t xml:space="preserve"> - Yes - the synthetic 46-document corpus (fictional company, from an AI-drafted spec), benchmark utterances, README/docs, presentation text and demo-video narration were drafted with AI.</w:t>
+        <w:t xml:space="preserve"> - Yes - the synthetic 46-document corpus (fictional company, from an AI-drafted spec), benchmark utterances, README/docs, presentation text and the demo-video storyboard were drafted with AI.</w:t>
       </w:r>
     </w:p>
     <w:p>
@@ -216,7 +216,7 @@
       </w:r>
       <w:r/>
       <w:r>
-        <w:t xml:space="preserve"> - Runtime: the prototype itself uses only two small open-source ONNX models (BAAI/bge-small-en-v1.5, ms-marco-MiniLM-L-6-v2); no generative model in the default answer path. Demo video recorded automatically (Playwright) with offline text-to-speech narration (Piper).</w:t>
+        <w:t xml:space="preserve"> - Runtime: the prototype itself uses only two small open-source ONNX models (BAAI/bge-small-en-v1.5, ms-marco-MiniLM-L-6-v2); no generative model in the default answer path. Demo video recorded automatically (Playwright): animated storyboard scenes plus guided-tour recordings of live replays, no narration.</w:t>
       </w:r>
     </w:p>
     <w:p/>
@@ -543,7 +543,7 @@
         <w:rPr>
           <w:sz w:val="21"/>
         </w:rPr>
-        <w:t>Description: Tool: Claude Code (python-pptx on the official template, matplotlib figures, Playwright recording, Piper TTS). Output: README, architecture brief, benchmark report, deck, video.</w:t>
+        <w:t>Description: Tool: Claude Code (python-pptx on the official template, matplotlib figures, HTML/CSS motion graphics, Playwright recording). Output: README, architecture brief, benchmark report, deck, video.</w:t>
       </w:r>
       <w:proofErr w:type="gramStart"/>
       <w:r>

</xml_diff>